<commit_message>
Added alternate facilities doc
</commit_message>
<xml_diff>
--- a/documents/List of Project Personnel and Partner Institutions.docx
+++ b/documents/List of Project Personnel and Partner Institutions.docx
@@ -62,7 +62,13 @@
         </w:numPr>
       </w:pPr>
       <w:r>
-        <w:t>Adam Doupe; Arizona State University; Co-PI</w:t>
+        <w:t>Adam Doup</w:t>
+      </w:r>
+      <w:r>
+        <w:t>é</w:t>
+      </w:r>
+      <w:r>
+        <w:t>; Arizona State University; Co-PI</w:t>
       </w:r>
     </w:p>
     <w:p>
@@ -79,7 +85,13 @@
       </w:r>
       <w:proofErr w:type="spellEnd"/>
       <w:r>
-        <w:t xml:space="preserve"> ‘Tiffany’ Bao; Arizona State University, Co-PI</w:t>
+        <w:t xml:space="preserve"> ‘Tiffany’ Bao; Arizona State University</w:t>
+      </w:r>
+      <w:r>
+        <w:t>;</w:t>
+      </w:r>
+      <w:r>
+        <w:t xml:space="preserve"> Co-PI</w:t>
       </w:r>
     </w:p>
     <w:p>
@@ -115,7 +127,7 @@
         </w:numPr>
       </w:pPr>
       <w:r>
-        <w:t>Buu Lam; NGINX Software, Inc., F5, Inc.; Unpaid Collaborator</w:t>
+        <w:t>Buu Lam; F5, Inc.; Unpaid Collaborator</w:t>
       </w:r>
     </w:p>
     <w:p>
@@ -127,7 +139,13 @@
         </w:numPr>
       </w:pPr>
       <w:r>
-        <w:t>Gabriele Saltomaggio; RabbitMQ / Broadcom, Inc.; Unpaid Collaborator</w:t>
+        <w:t>Gabriele Sa</w:t>
+      </w:r>
+      <w:r>
+        <w:t>n</w:t>
+      </w:r>
+      <w:r>
+        <w:t>tomaggio; Broadcom, Inc.; Unpaid Collaborator</w:t>
       </w:r>
     </w:p>
     <w:p>

</xml_diff>